<commit_message>
Personalize report, rewrite explanations and generate new geometric scene
</commit_message>
<xml_diff>
--- a/report/Лабораторная работа.docx
+++ b/report/Лабораторная работа.docx
@@ -242,7 +242,7 @@
         </w:rPr>
         <w:t>Студент:</w:t>
         <w:tab/>
-        <w:t>Ф. И. О.</w:t>
+        <w:t>Дутов Р. В.</w:t>
       </w:r>
       <w:r/>
       <w:r>
@@ -678,17 +678,7 @@
         <w:rPr>
           <w:rFonts w:cs="Times New Roman"/>
         </w:rPr>
-        <w:t>Вариант № 1. Выделение контуров на изображении:</w:t>
-      </w:r>
-      <w:r>
-        <w:rPr>
-          <w:rFonts w:cs="Times New Roman"/>
-        </w:rPr>
-      </w:r>
-      <w:r>
-        <w:rPr>
-          <w:rFonts w:cs="Times New Roman"/>
-        </w:rPr>
+        <w:t>Вариант № 1. Найти границы объектов тремя способами:</w:t>
       </w:r>
     </w:p>
     <w:p>
@@ -708,7 +698,7 @@
         <w:rPr>
           <w:rFonts w:cs="Times New Roman"/>
         </w:rPr>
-        <w:t>оператор Лапласа;</w:t>
+        <w:t>с помощью лапласиана;</w:t>
       </w:r>
     </w:p>
     <w:p>
@@ -728,7 +718,7 @@
         <w:rPr>
           <w:rFonts w:cs="Times New Roman"/>
         </w:rPr>
-        <w:t>оператор Робертса;</w:t>
+        <w:t>с помощью разностей Робертса;</w:t>
       </w:r>
     </w:p>
     <w:p>
@@ -748,21 +738,7 @@
         <w:rPr>
           <w:rFonts w:cs="Times New Roman"/>
         </w:rPr>
-        <w:t xml:space="preserve">оператор </w:t>
-      </w:r>
-      <w:proofErr w:type="spellStart"/>
-      <w:r>
-        <w:rPr>
-          <w:rFonts w:cs="Times New Roman"/>
-        </w:rPr>
-        <w:t>Собела</w:t>
-      </w:r>
-      <w:proofErr w:type="spellEnd"/>
-      <w:r>
-        <w:rPr>
-          <w:rFonts w:cs="Times New Roman"/>
-        </w:rPr>
-        <w:t>.</w:t>
+        <w:t>с помощью градиента Собела.</w:t>
       </w:r>
     </w:p>
     <w:p>
@@ -782,7 +758,7 @@
         <w:rPr>
           <w:rFonts w:cs="Times New Roman"/>
         </w:rPr>
-        <w:t>Вариант № 2. Удаление гауссова шума с изображений в пространственной области усредняющими фильтрами. Шум добавляется программно с фиксированным начальным состоянием генератора.</w:t>
+        <w:t>Вариант № 2. Выполнить пространственное сглаживание изображения с гауссовым шумом. Сравнить равномерное усреднение и взвешенный фильтр Гаусса; шум сформировать программно.</w:t>
       </w:r>
     </w:p>
     <w:p>
@@ -837,223 +813,7 @@
         <w:rPr>
           <w:rFonts w:cs="Times New Roman"/>
         </w:rPr>
-        <w:t>Изображение рассматривается как двумерная дискретная функция</w:t>
-      </w:r>
-      <w:r>
-        <w:rPr>
-          <w:rFonts w:cs="Times New Roman"/>
-        </w:rPr>
-        <w:t xml:space="preserve"> </w:t>
-      </w:r>
-      <w:r>
-        <w:br/>
-      </w:r>
-      <m:oMath>
-        <m:r>
-          <w:rPr>
-            <w:rFonts w:ascii="Cambria Math" w:hAnsi="Cambria Math" w:cs="Times New Roman"/>
-          </w:rPr>
-          <m:t>I=</m:t>
-        </m:r>
-        <m:d>
-          <m:dPr>
-            <m:ctrlPr>
-              <w:rPr>
-                <w:rFonts w:ascii="Cambria Math" w:hAnsi="Cambria Math" w:cs="Times New Roman"/>
-                <w:i/>
-                <w:iCs/>
-              </w:rPr>
-            </m:ctrlPr>
-          </m:dPr>
-          <m:e>
-            <m:r>
-              <w:rPr>
-                <w:rFonts w:ascii="Cambria Math" w:hAnsi="Cambria Math" w:cs="Times New Roman"/>
-              </w:rPr>
-              <m:t>x,y</m:t>
-            </m:r>
-          </m:e>
-        </m:d>
-      </m:oMath>
-      <w:r>
-        <w:rPr>
-          <w:rFonts w:cs="Times New Roman"/>
-        </w:rPr>
-        <w:t xml:space="preserve">, где </w:t>
-      </w:r>
-      <m:oMath>
-        <m:r>
-          <w:rPr>
-            <w:rFonts w:ascii="Cambria Math" w:hAnsi="Cambria Math" w:cs="Times New Roman"/>
-          </w:rPr>
-          <m:t>x∈</m:t>
-        </m:r>
-        <m:d>
-          <m:dPr>
-            <m:begChr m:val="["/>
-            <m:endChr m:val="]"/>
-            <m:ctrlPr>
-              <w:rPr>
-                <w:rFonts w:ascii="Cambria Math" w:hAnsi="Cambria Math" w:cs="Times New Roman"/>
-                <w:i/>
-                <w:iCs/>
-              </w:rPr>
-            </m:ctrlPr>
-          </m:dPr>
-          <m:e>
-            <m:r>
-              <w:rPr>
-                <w:rFonts w:ascii="Cambria Math" w:hAnsi="Cambria Math" w:cs="Times New Roman"/>
-              </w:rPr>
-              <m:t>0,W-1</m:t>
-            </m:r>
-          </m:e>
-        </m:d>
-      </m:oMath>
-      <w:r>
-        <w:rPr>
-          <w:rFonts w:eastAsiaTheme="minorEastAsia" w:cs="Times New Roman"/>
-        </w:rPr>
-        <w:t xml:space="preserve">, </w:t>
-      </w:r>
-      <m:oMath>
-        <m:r>
-          <w:rPr>
-            <w:rFonts w:ascii="Cambria Math" w:hAnsi="Cambria Math" w:cs="Times New Roman"/>
-          </w:rPr>
-          <m:t>y∈</m:t>
-        </m:r>
-        <m:d>
-          <m:dPr>
-            <m:begChr m:val="["/>
-            <m:endChr m:val="]"/>
-            <m:ctrlPr>
-              <w:rPr>
-                <w:rFonts w:ascii="Cambria Math" w:hAnsi="Cambria Math" w:cs="Times New Roman"/>
-                <w:i/>
-                <w:iCs/>
-              </w:rPr>
-            </m:ctrlPr>
-          </m:dPr>
-          <m:e>
-            <m:r>
-              <w:rPr>
-                <w:rFonts w:ascii="Cambria Math" w:hAnsi="Cambria Math" w:cs="Times New Roman"/>
-              </w:rPr>
-              <m:t>0,H-1</m:t>
-            </m:r>
-          </m:e>
-        </m:d>
-      </m:oMath>
-      <w:r>
-        <w:rPr>
-          <w:rFonts w:cs="Times New Roman"/>
-        </w:rPr>
-        <w:t xml:space="preserve">, </w:t>
-      </w:r>
-      <m:oMath>
-        <m:r>
-          <w:rPr>
-            <w:rFonts w:ascii="Cambria Math" w:hAnsi="Cambria Math" w:cs="Times New Roman"/>
-          </w:rPr>
-          <m:t>W</m:t>
-        </m:r>
-      </m:oMath>
-      <w:r>
-        <w:rPr>
-          <w:rFonts w:cs="Times New Roman"/>
-        </w:rPr>
-        <w:t xml:space="preserve"> и </w:t>
-      </w:r>
-      <m:oMath>
-        <m:r>
-          <w:rPr>
-            <w:rFonts w:ascii="Cambria Math" w:hAnsi="Cambria Math" w:cs="Times New Roman"/>
-          </w:rPr>
-          <m:t>H</m:t>
-        </m:r>
-      </m:oMath>
-      <w:r>
-        <w:rPr>
-          <w:rFonts w:cs="Times New Roman"/>
-        </w:rPr>
-        <w:t xml:space="preserve"> — соответственно ширина и высота растра в пикселях, а значение </w:t>
-      </w:r>
-      <m:oMath>
-        <m:r>
-          <w:rPr>
-            <w:rFonts w:ascii="Cambria Math" w:hAnsi="Cambria Math" w:cs="Times New Roman"/>
-          </w:rPr>
-          <m:t>I=</m:t>
-        </m:r>
-        <m:d>
-          <m:dPr>
-            <m:ctrlPr>
-              <w:rPr>
-                <w:rFonts w:ascii="Cambria Math" w:hAnsi="Cambria Math" w:cs="Times New Roman"/>
-                <w:i/>
-                <w:iCs/>
-              </w:rPr>
-            </m:ctrlPr>
-          </m:dPr>
-          <m:e>
-            <m:r>
-              <w:rPr>
-                <w:rFonts w:ascii="Cambria Math" w:hAnsi="Cambria Math" w:cs="Times New Roman"/>
-              </w:rPr>
-              <m:t>x,y</m:t>
-            </m:r>
-          </m:e>
-        </m:d>
-        <m:r>
-          <w:rPr>
-            <w:rFonts w:ascii="Cambria Math" w:eastAsiaTheme="minorEastAsia" w:hAnsi="Cambria Math" w:cs="Times New Roman"/>
-          </w:rPr>
-          <m:t>∈</m:t>
-        </m:r>
-        <m:d>
-          <m:dPr>
-            <m:begChr m:val="["/>
-            <m:endChr m:val="]"/>
-            <m:ctrlPr>
-              <w:rPr>
-                <w:rFonts w:ascii="Cambria Math" w:hAnsi="Cambria Math" w:cs="Times New Roman"/>
-                <w:iCs/>
-              </w:rPr>
-            </m:ctrlPr>
-          </m:dPr>
-          <m:e>
-            <m:r>
-              <m:rPr>
-                <m:sty m:val="p"/>
-              </m:rPr>
-              <w:rPr>
-                <w:rFonts w:ascii="Cambria Math" w:hAnsi="Cambria Math" w:cs="Times New Roman"/>
-              </w:rPr>
-              <m:t>0,255</m:t>
-            </m:r>
-          </m:e>
-        </m:d>
-      </m:oMath>
-      <w:r>
-        <w:rPr>
-          <w:rFonts w:cs="Times New Roman"/>
-        </w:rPr>
-        <w:t xml:space="preserve"> соответствует яркости в узле сетки. Для цветных изображений предварительно осуществляется переход к полутоновому представлению (</w:t>
-      </w:r>
-      <w:proofErr w:type="spellStart"/>
-      <w:r>
-        <w:rPr>
-          <w:rFonts w:cs="Times New Roman"/>
-        </w:rPr>
-        <w:t>grayscale</w:t>
-      </w:r>
-      <w:proofErr w:type="spellEnd"/>
-      <w:r>
-        <w:rPr>
-          <w:rFonts w:cs="Times New Roman"/>
-        </w:rPr>
-        <w:t>) по стандартной психофизической формуле яркости (1):</w:t>
+        <w:t>Растровое изображение задаётся таблицей яркостей I(x, y). Координаты принимают целые значения: 0 ≤ x &lt; W и 0 ≤ y &lt; H, где W — ширина, H — высота. Для восьмибитного изображения яркость лежит в пределах 0–255. Если вход содержит цветовые каналы, сначала вычисляется полутоновая яркость по соотношению (1):</w:t>
       </w:r>
     </w:p>
     <w:p>
@@ -1218,7 +978,7 @@
         <w:rPr>
           <w:rFonts w:cs="Times New Roman"/>
         </w:rPr>
-        <w:t>Контуры характеризуются резкими локальными перепадами яркости, которые определяются производными первого и второго порядков.</w:t>
+        <w:t>Граница объекта соответствует быстрому изменению яркости соседних пикселей. Для обнаружения такого изменения можно использовать приближённые первые либо вторые производные.</w:t>
       </w:r>
     </w:p>
     <w:p>
@@ -1279,7 +1039,7 @@
         <w:rPr>
           <w:rFonts w:cs="Times New Roman"/>
         </w:rPr>
-        <w:t>Осуществляет вычисление градиента функции яркости с предварительным локальным сглаживанием, перпендикулярным направлению дифференцирования. Применяются свертки с двумя пространственными масками размера 3×3 (2):</w:t>
+        <w:t>Метод Собела оценивает две составляющие градиента. Дифференцирование по одной оси сочетается со сглаживанием по другой, что частично уменьшает влияние случайных колебаний. Для расчёта служат два ядра 3×3, приведённые в (2):</w:t>
       </w:r>
     </w:p>
     <w:p>
@@ -1611,49 +1371,7 @@
         <w:rPr>
           <w:rFonts w:eastAsiaTheme="minorEastAsia" w:cs="Times New Roman"/>
         </w:rPr>
-        <w:t>Итоговая</w:t>
-      </w:r>
-      <w:r>
-        <w:rPr>
-          <w:rFonts w:eastAsiaTheme="minorEastAsia" w:cs="Times New Roman"/>
-        </w:rPr>
-        <w:t xml:space="preserve"> </w:t>
-      </w:r>
-      <w:r>
-        <w:rPr>
-          <w:rFonts w:eastAsiaTheme="minorEastAsia" w:cs="Times New Roman"/>
-        </w:rPr>
-        <w:t>амплитуда градиента</w:t>
-      </w:r>
-      <w:r>
-        <w:rPr>
-          <w:rFonts w:eastAsiaTheme="minorEastAsia" w:cs="Times New Roman"/>
-        </w:rPr>
-        <w:t xml:space="preserve"> </w:t>
-      </w:r>
-      <w:r>
-        <w:rPr>
-          <w:rFonts w:eastAsiaTheme="minorEastAsia" w:cs="Times New Roman"/>
-        </w:rPr>
-        <w:t>рассчитывается по евклидовой норме</w:t>
-      </w:r>
-      <w:r>
-        <w:rPr>
-          <w:rFonts w:eastAsiaTheme="minorEastAsia" w:cs="Times New Roman"/>
-        </w:rPr>
-        <w:t xml:space="preserve"> (3) с </w:t>
-      </w:r>
-      <w:r>
-        <w:rPr>
-          <w:rFonts w:eastAsiaTheme="minorEastAsia" w:cs="Times New Roman"/>
-        </w:rPr>
-        <w:t>отсечением диапазона</w:t>
-      </w:r>
-      <w:r>
-        <w:rPr>
-          <w:rFonts w:eastAsiaTheme="minorEastAsia" w:cs="Times New Roman"/>
-        </w:rPr>
-        <w:t>(4):</w:t>
+        <w:t>Длину полученного вектора определяем по выражению (3). Перед записью в восьмибитное изображение применяем ограничение (4):</w:t>
       </w:r>
     </w:p>
     <w:p>
@@ -2079,7 +1797,7 @@
         <w:rPr>
           <w:rFonts w:cs="Times New Roman"/>
         </w:rPr>
-        <w:t>Преобразовать входное изображение в полутоновое по формуле (1).</w:t>
+        <w:t>Вычислить яркость каждого пикселя с использованием (1).</w:t>
       </w:r>
     </w:p>
     <w:p>
@@ -2099,181 +1817,7 @@
         <w:rPr>
           <w:rFonts w:cs="Times New Roman"/>
         </w:rPr>
-        <w:t xml:space="preserve">Для каждого внутреннего пикселя </w:t>
-      </w:r>
-      <m:oMath>
-        <m:d>
-          <m:dPr>
-            <m:ctrlPr>
-              <w:rPr>
-                <w:rStyle w:val="math-inline"/>
-                <w:rFonts w:ascii="Cambria Math" w:eastAsiaTheme="minorEastAsia" w:hAnsi="Cambria Math" w:cs="Times New Roman"/>
-                <w:i/>
-              </w:rPr>
-            </m:ctrlPr>
-          </m:dPr>
-          <m:e>
-            <m:r>
-              <w:rPr>
-                <w:rStyle w:val="math-inline"/>
-                <w:rFonts w:ascii="Cambria Math" w:eastAsiaTheme="minorEastAsia" w:hAnsi="Cambria Math" w:cs="Times New Roman"/>
-              </w:rPr>
-              <m:t>x,y</m:t>
-            </m:r>
-          </m:e>
-        </m:d>
-      </m:oMath>
-      <w:r>
-        <w:rPr>
-          <w:rStyle w:val="math-inline"/>
-          <w:rFonts w:eastAsiaTheme="minorEastAsia" w:cs="Times New Roman"/>
-        </w:rPr>
-        <w:t xml:space="preserve"> </w:t>
-      </w:r>
-      <w:r>
-        <w:rPr>
-          <w:rFonts w:cs="Times New Roman"/>
-        </w:rPr>
-        <w:t xml:space="preserve">вычислить свертки </w:t>
-      </w:r>
-      <m:oMath>
-        <m:sSub>
-          <m:sSubPr>
-            <m:ctrlPr>
-              <w:rPr>
-                <w:rStyle w:val="math-inline"/>
-                <w:rFonts w:ascii="Cambria Math" w:hAnsi="Cambria Math" w:cs="Times New Roman"/>
-                <w:i/>
-              </w:rPr>
-            </m:ctrlPr>
-          </m:sSubPr>
-          <m:e>
-            <m:r>
-              <w:rPr>
-                <w:rStyle w:val="math-inline"/>
-                <w:rFonts w:ascii="Cambria Math" w:hAnsi="Cambria Math" w:cs="Times New Roman"/>
-              </w:rPr>
-              <m:t>G</m:t>
-            </m:r>
-          </m:e>
-          <m:sub>
-            <m:r>
-              <w:rPr>
-                <w:rStyle w:val="math-inline"/>
-                <w:rFonts w:ascii="Cambria Math" w:hAnsi="Cambria Math" w:cs="Times New Roman"/>
-              </w:rPr>
-              <m:t>x</m:t>
-            </m:r>
-          </m:sub>
-        </m:sSub>
-        <m:d>
-          <m:dPr>
-            <m:ctrlPr>
-              <w:rPr>
-                <w:rStyle w:val="math-inline"/>
-                <w:rFonts w:ascii="Cambria Math" w:hAnsi="Cambria Math" w:cs="Times New Roman"/>
-                <w:i/>
-              </w:rPr>
-            </m:ctrlPr>
-          </m:dPr>
-          <m:e>
-            <m:r>
-              <w:rPr>
-                <w:rStyle w:val="math-inline"/>
-                <w:rFonts w:ascii="Cambria Math" w:hAnsi="Cambria Math" w:cs="Times New Roman"/>
-              </w:rPr>
-              <m:t>x,y</m:t>
-            </m:r>
-          </m:e>
-        </m:d>
-      </m:oMath>
-      <w:r>
-        <w:rPr>
-          <w:rFonts w:cs="Times New Roman"/>
-        </w:rPr>
-        <w:t xml:space="preserve"> и </w:t>
-      </w:r>
-      <m:oMath>
-        <m:sSub>
-          <m:sSubPr>
-            <m:ctrlPr>
-              <w:rPr>
-                <w:rStyle w:val="math-inline"/>
-                <w:rFonts w:ascii="Cambria Math" w:hAnsi="Cambria Math" w:cs="Times New Roman"/>
-                <w:i/>
-              </w:rPr>
-            </m:ctrlPr>
-          </m:sSubPr>
-          <m:e>
-            <m:r>
-              <w:rPr>
-                <w:rStyle w:val="math-inline"/>
-                <w:rFonts w:ascii="Cambria Math" w:hAnsi="Cambria Math" w:cs="Times New Roman"/>
-              </w:rPr>
-              <m:t>G</m:t>
-            </m:r>
-          </m:e>
-          <m:sub>
-            <m:r>
-              <w:rPr>
-                <w:rStyle w:val="math-inline"/>
-                <w:rFonts w:ascii="Cambria Math" w:hAnsi="Cambria Math" w:cs="Times New Roman"/>
-              </w:rPr>
-              <m:t>y</m:t>
-            </m:r>
-          </m:sub>
-        </m:sSub>
-        <m:d>
-          <m:dPr>
-            <m:ctrlPr>
-              <w:rPr>
-                <w:rStyle w:val="math-inline"/>
-                <w:rFonts w:ascii="Cambria Math" w:hAnsi="Cambria Math" w:cs="Times New Roman"/>
-                <w:i/>
-              </w:rPr>
-            </m:ctrlPr>
-          </m:dPr>
-          <m:e>
-            <m:r>
-              <w:rPr>
-                <w:rStyle w:val="math-inline"/>
-                <w:rFonts w:ascii="Cambria Math" w:hAnsi="Cambria Math" w:cs="Times New Roman"/>
-              </w:rPr>
-              <m:t>x,y</m:t>
-            </m:r>
-          </m:e>
-        </m:d>
-      </m:oMath>
-      <w:r>
-        <w:rPr>
-          <w:rStyle w:val="math-inline"/>
-          <w:rFonts w:eastAsiaTheme="minorEastAsia" w:cs="Times New Roman"/>
-        </w:rPr>
-        <w:t xml:space="preserve"> </w:t>
-      </w:r>
-      <w:r>
-        <w:rPr>
-          <w:rFonts w:cs="Times New Roman"/>
-        </w:rPr>
-        <w:t>по</w:t>
-      </w:r>
-      <w:r>
-        <w:rPr>
-          <w:rFonts w:cs="Times New Roman"/>
-        </w:rPr>
-        <w:t xml:space="preserve"> </w:t>
-      </w:r>
-      <w:r>
-        <w:rPr>
-          <w:rFonts w:cs="Times New Roman"/>
-        </w:rPr>
-        <w:t>маскам</w:t>
-      </w:r>
-      <w:r>
-        <w:rPr>
-          <w:rFonts w:cs="Times New Roman"/>
-        </w:rPr>
-        <w:t xml:space="preserve"> (2).</w:t>
+        <w:t>В каждой позиции получить Gx и Gy, применяя оба ядра из (2).</w:t>
       </w:r>
     </w:p>
     <w:p>
@@ -2293,7 +1837,7 @@
         <w:rPr>
           <w:rFonts w:cs="Times New Roman"/>
         </w:rPr>
-        <w:t>Найти модуль вектора градиента по формуле (3).</w:t>
+        <w:t>Рассчитать длину градиента согласно выражению (3).</w:t>
       </w:r>
     </w:p>
     <w:p>
@@ -2313,37 +1857,7 @@
         <w:rPr>
           <w:rFonts w:cs="Times New Roman"/>
         </w:rPr>
-        <w:t xml:space="preserve">Нормализовать полученное значение в диапазон </w:t>
-      </w:r>
-      <m:oMath>
-        <m:d>
-          <m:dPr>
-            <m:begChr m:val="["/>
-            <m:endChr m:val="]"/>
-            <m:ctrlPr>
-              <w:rPr>
-                <w:rStyle w:val="math-inline"/>
-                <w:rFonts w:ascii="Cambria Math" w:hAnsi="Cambria Math" w:cs="Times New Roman"/>
-                <w:i/>
-              </w:rPr>
-            </m:ctrlPr>
-          </m:dPr>
-          <m:e>
-            <m:r>
-              <w:rPr>
-                <w:rStyle w:val="math-inline"/>
-                <w:rFonts w:ascii="Cambria Math" w:hAnsi="Cambria Math" w:cs="Times New Roman"/>
-              </w:rPr>
-              <m:t>0,255</m:t>
-            </m:r>
-          </m:e>
-        </m:d>
-      </m:oMath>
-      <w:r>
-        <w:rPr>
-          <w:rFonts w:cs="Times New Roman"/>
-        </w:rPr>
-        <w:t xml:space="preserve"> по формуле (4).</w:t>
+        <w:t>Ограничить амплитуду значениями 0–255 по правилу (4).</w:t>
       </w:r>
     </w:p>
     <w:p/>
@@ -2393,7 +1907,7 @@
         </w:rPr>
       </w:pPr>
       <w:r>
-        <w:t>Использует диагональные конечные разности на компактной апертуре размера 2×2 (5):</w:t>
+        <w:t>В методе Робертса используются четыре соседних пикселя. Два ядра 2×2 позволяют оценить перепады яркости вдоль диагоналей; их вид указан в (5):</w:t>
       </w:r>
     </w:p>
     <w:p>
@@ -2662,7 +2176,7 @@
         <w:rPr>
           <w:rFonts w:eastAsiaTheme="minorEastAsia" w:cs="Times New Roman"/>
         </w:rPr>
-        <w:t>Аналитическое вычисление компонент разностей:</w:t>
+        <w:t>Компоненты отклика можно записать непосредственно через разности яркостей:</w:t>
       </w:r>
     </w:p>
     <w:p>
@@ -2889,7 +2403,7 @@
         <w:jc w:val="both"/>
       </w:pPr>
       <w:r>
-        <w:t>Значение амплитуды вычисляется по формуле (3) и ограничивается формулой (4).</w:t>
+        <w:t>Далее две компоненты объединяются по правилу (3), а результат обрезается в соответствии с (4).</w:t>
       </w:r>
     </w:p>
     <w:p>
@@ -2935,39 +2449,7 @@
         <w:rPr>
           <w:rFonts w:eastAsiaTheme="minorEastAsia" w:cs="Times New Roman"/>
         </w:rPr>
-        <w:t xml:space="preserve">Получить яркостную матрицу </w:t>
-      </w:r>
-      <m:oMath>
-        <m:r>
-          <w:rPr>
-            <w:rFonts w:ascii="Cambria Math" w:eastAsiaTheme="minorEastAsia" w:hAnsi="Cambria Math" w:cs="Times New Roman"/>
-          </w:rPr>
-          <m:t>I</m:t>
-        </m:r>
-        <m:d>
-          <m:dPr>
-            <m:ctrlPr>
-              <w:rPr>
-                <w:rFonts w:ascii="Cambria Math" w:eastAsiaTheme="minorEastAsia" w:hAnsi="Cambria Math" w:cs="Times New Roman"/>
-                <w:i/>
-              </w:rPr>
-            </m:ctrlPr>
-          </m:dPr>
-          <m:e>
-            <m:r>
-              <w:rPr>
-                <w:rFonts w:ascii="Cambria Math" w:eastAsiaTheme="minorEastAsia" w:hAnsi="Cambria Math" w:cs="Times New Roman"/>
-              </w:rPr>
-              <m:t>x,y</m:t>
-            </m:r>
-          </m:e>
-        </m:d>
-      </m:oMath>
-      <w:r>
-        <w:rPr>
-          <w:rFonts w:eastAsiaTheme="minorEastAsia" w:cs="Times New Roman"/>
-        </w:rPr>
-        <w:t xml:space="preserve"> по формуле (1).</w:t>
+        <w:t>Подготовить полутоновый растр, воспользовавшись (1).</w:t>
       </w:r>
     </w:p>
     <w:p>
@@ -2987,33 +2469,7 @@
         <w:rPr>
           <w:rFonts w:eastAsiaTheme="minorEastAsia" w:cs="Times New Roman"/>
         </w:rPr>
-        <w:t xml:space="preserve">Для каждой точки </w:t>
-      </w:r>
-      <m:oMath>
-        <m:d>
-          <m:dPr>
-            <m:ctrlPr>
-              <w:rPr>
-                <w:rFonts w:ascii="Cambria Math" w:eastAsiaTheme="minorEastAsia" w:hAnsi="Cambria Math" w:cs="Times New Roman"/>
-                <w:i/>
-              </w:rPr>
-            </m:ctrlPr>
-          </m:dPr>
-          <m:e>
-            <m:r>
-              <w:rPr>
-                <w:rFonts w:ascii="Cambria Math" w:eastAsiaTheme="minorEastAsia" w:hAnsi="Cambria Math" w:cs="Times New Roman"/>
-              </w:rPr>
-              <m:t>x,y</m:t>
-            </m:r>
-          </m:e>
-        </m:d>
-      </m:oMath>
-      <w:r>
-        <w:rPr>
-          <w:rFonts w:eastAsiaTheme="minorEastAsia" w:cs="Times New Roman"/>
-        </w:rPr>
-        <w:t xml:space="preserve"> вычислить диагональные разности согласно соотношениям (6).</w:t>
+        <w:t>Для текущего пикселя найти обе диагональные разности по (6).</w:t>
       </w:r>
     </w:p>
     <w:p>
@@ -3033,7 +2489,7 @@
         <w:rPr>
           <w:rFonts w:eastAsiaTheme="minorEastAsia" w:cs="Times New Roman"/>
         </w:rPr>
-        <w:t>Определить амплитуду градиента по формуле (3).</w:t>
+        <w:t>Объединить разности в амплитуду градиента согласно (3).</w:t>
       </w:r>
     </w:p>
     <w:p>
@@ -3053,7 +2509,7 @@
         <w:rPr>
           <w:rFonts w:eastAsiaTheme="minorEastAsia" w:cs="Times New Roman"/>
         </w:rPr>
-        <w:t>Записать результат в выходное изображение с учетом нормализации (4).</w:t>
+        <w:t>Применить ограничение (4) и сохранить вычисленную яркость.</w:t>
       </w:r>
     </w:p>
     <w:p>
@@ -3100,7 +2556,7 @@
         <w:ind w:firstLine="720"/>
       </w:pPr>
       <w:r>
-        <w:t>Представляет собой изотропный оператор второй пространственной производной (7):</w:t>
+        <w:t>Лапласиан складывает вторые производные яркости по двум осям. Его непрерывная запись имеет вид (7):</w:t>
       </w:r>
     </w:p>
     <w:p>
@@ -3332,7 +2788,7 @@
     </w:p>
     <w:p>
       <w:r>
-        <w:t>В дискретном двумерном пространстве оператор задается ядром свертки 3×3 (8):</w:t>
+        <w:t>Для растра производные заменяются конечными разностями. В работе принята четырёхсвязная маска 3×3 из выражения (8):</w:t>
       </w:r>
     </w:p>
     <w:p>
@@ -3479,7 +2935,7 @@
     </w:p>
     <w:p>
       <w:r>
-        <w:t>Отклик оператора берется по абсолютному значению для формирования границ (9):</w:t>
+        <w:t>Отклик может иметь любой знак. Чтобы представить его как яркость границы, используем модуль и ограничиваем диапазон, как показано в (9):</w:t>
       </w:r>
     </w:p>
     <w:p>
@@ -3679,7 +3135,7 @@
         </w:numPr>
       </w:pPr>
       <w:r>
-        <w:t>Сформировать полутоновое изображение по формуле (1).</w:t>
+        <w:t>Преобразовать цветной вход в яркостную матрицу по (1).</w:t>
       </w:r>
     </w:p>
     <w:p>
@@ -3691,18 +3147,7 @@
         </w:numPr>
       </w:pPr>
       <w:r>
-        <w:t xml:space="preserve">Выполнить двумерную дискретную свертку матрицы изображения с ядром </w:t>
-      </w:r>
-      <m:oMath>
-        <m:r>
-          <w:rPr>
-            <w:rFonts w:ascii="Cambria Math" w:hAnsi="Cambria Math"/>
-          </w:rPr>
-          <m:t>L</m:t>
-        </m:r>
-      </m:oMath>
-      <w:r>
-        <w:t xml:space="preserve"> (8).</w:t>
+        <w:t>Для каждой позиции вычислить отклик ядра Лапласа из (8).</w:t>
       </w:r>
     </w:p>
     <w:p>
@@ -3714,7 +3159,7 @@
         </w:numPr>
       </w:pPr>
       <w:r>
-        <w:t>Взять абсолютное значение полученного результата согласно (9).</w:t>
+        <w:t>Взять модуль отклика и записать результат с учётом (9).</w:t>
       </w:r>
     </w:p>
     <w:p>
@@ -3751,7 +3196,7 @@
         </w:rPr>
       </w:pPr>
       <w:r>
-        <w:t>Усредняющие фильтры предназначены для подавления аддитивного гауссова шума за счет взвешенного интегрирования значений в окрестности точки.</w:t>
+        <w:t>Случайные отклонения яркости можно ослабить, заменяя отдельный отсчёт средним по соседним точкам. При равных весах получается прямоугольное усреднение, при весах, зависящих от расстояния, — взвешенное сглаживание.</w:t>
       </w:r>
     </w:p>
     <w:p>
@@ -3799,93 +3244,7 @@
         <w:rPr>
           <w:lang w:eastAsia="ru-RU"/>
         </w:rPr>
-        <w:t xml:space="preserve">Значение пикселя заменяется средним арифметическим значений в окрестности размера </w:t>
-      </w:r>
-      <m:oMath>
-        <m:r>
-          <w:rPr>
-            <w:rFonts w:ascii="Cambria Math" w:hAnsi="Cambria Math"/>
-            <w:lang w:eastAsia="ru-RU"/>
-          </w:rPr>
-          <m:t xml:space="preserve">k </m:t>
-        </m:r>
-        <m:r>
-          <m:rPr>
-            <m:sty m:val="p"/>
-          </m:rPr>
-          <w:rPr>
-            <w:rFonts w:ascii="Cambria Math" w:hAnsi="Cambria Math"/>
-            <w:lang w:eastAsia="ru-RU"/>
-          </w:rPr>
-          <m:t>×</m:t>
-        </m:r>
-        <m:r>
-          <w:rPr>
-            <w:rFonts w:ascii="Cambria Math" w:hAnsi="Cambria Math"/>
-            <w:lang w:eastAsia="ru-RU"/>
-          </w:rPr>
-          <m:t>k</m:t>
-        </m:r>
-      </m:oMath>
-      <w:r>
-        <w:rPr>
-          <w:lang w:eastAsia="ru-RU"/>
-        </w:rPr>
-        <w:t xml:space="preserve"> с радиусом </w:t>
-      </w:r>
-      <m:oMath>
-        <m:r>
-          <w:rPr>
-            <w:rFonts w:ascii="Cambria Math" w:hAnsi="Cambria Math"/>
-            <w:lang w:eastAsia="ru-RU"/>
-          </w:rPr>
-          <m:t>r=</m:t>
-        </m:r>
-        <m:d>
-          <m:dPr>
-            <m:begChr m:val="["/>
-            <m:endChr m:val="]"/>
-            <m:ctrlPr>
-              <w:rPr>
-                <w:rFonts w:ascii="Cambria Math" w:hAnsi="Cambria Math"/>
-                <w:i/>
-                <w:lang w:eastAsia="ru-RU"/>
-              </w:rPr>
-            </m:ctrlPr>
-          </m:dPr>
-          <m:e>
-            <m:r>
-              <w:rPr>
-                <w:rFonts w:ascii="Cambria Math" w:hAnsi="Cambria Math"/>
-                <w:lang w:eastAsia="ru-RU"/>
-              </w:rPr>
-              <m:t>k</m:t>
-            </m:r>
-            <m:r>
-              <m:rPr>
-                <m:lit/>
-              </m:rPr>
-              <w:rPr>
-                <w:rFonts w:ascii="Cambria Math" w:hAnsi="Cambria Math"/>
-                <w:lang w:eastAsia="ru-RU"/>
-              </w:rPr>
-              <m:t>/</m:t>
-            </m:r>
-            <m:r>
-              <w:rPr>
-                <w:rFonts w:ascii="Cambria Math" w:hAnsi="Cambria Math"/>
-                <w:lang w:eastAsia="ru-RU"/>
-              </w:rPr>
-              <m:t>2</m:t>
-            </m:r>
-          </m:e>
-        </m:d>
-      </m:oMath>
-      <w:r>
-        <w:rPr>
-          <w:lang w:eastAsia="ru-RU"/>
-        </w:rPr>
-        <w:t xml:space="preserve"> (10):</w:t>
+        <w:t>В прямоугольном фильтре все элементы окна участвуют с одинаковым весом. Для нечётного размера k и радиуса r = (k − 1)/2 используется среднее, заданное формулой (10):</w:t>
       </w:r>
     </w:p>
     <w:p>
@@ -4162,82 +3521,7 @@
         <w:rPr>
           <w:lang w:eastAsia="ru-RU"/>
         </w:rPr>
-        <w:t xml:space="preserve">Задать нечетный линейный размер ядра </w:t>
-      </w:r>
-      <m:oMath>
-        <m:r>
-          <w:rPr>
-            <w:rFonts w:ascii="Cambria Math" w:hAnsi="Cambria Math"/>
-            <w:lang w:eastAsia="ru-RU"/>
-          </w:rPr>
-          <m:t>k</m:t>
-        </m:r>
-      </m:oMath>
-      <w:r>
-        <w:rPr>
-          <w:lang w:eastAsia="ru-RU"/>
-        </w:rPr>
-        <w:t xml:space="preserve"> и вычислить радиус </w:t>
-      </w:r>
-      <m:oMath>
-        <m:r>
-          <w:rPr>
-            <w:rFonts w:ascii="Cambria Math" w:hAnsi="Cambria Math"/>
-            <w:lang w:eastAsia="ru-RU"/>
-          </w:rPr>
-          <m:t>r=</m:t>
-        </m:r>
-        <m:d>
-          <m:dPr>
-            <m:begChr m:val="["/>
-            <m:endChr m:val="]"/>
-            <m:ctrlPr>
-              <w:rPr>
-                <w:rFonts w:ascii="Cambria Math" w:hAnsi="Cambria Math"/>
-                <w:lang w:eastAsia="ru-RU"/>
-              </w:rPr>
-            </m:ctrlPr>
-          </m:dPr>
-          <m:e>
-            <m:r>
-              <w:rPr>
-                <w:rFonts w:ascii="Cambria Math" w:hAnsi="Cambria Math"/>
-                <w:lang w:eastAsia="ru-RU"/>
-              </w:rPr>
-              <m:t>k</m:t>
-            </m:r>
-            <m:r>
-              <m:rPr>
-                <m:lit/>
-              </m:rPr>
-              <w:rPr>
-                <w:rFonts w:ascii="Cambria Math" w:hAnsi="Cambria Math"/>
-                <w:lang w:eastAsia="ru-RU"/>
-              </w:rPr>
-              <m:t>/</m:t>
-            </m:r>
-            <m:r>
-              <w:rPr>
-                <w:rFonts w:ascii="Cambria Math" w:hAnsi="Cambria Math"/>
-                <w:lang w:eastAsia="ru-RU"/>
-              </w:rPr>
-              <m:t>2</m:t>
-            </m:r>
-            <m:ctrlPr>
-              <w:rPr>
-                <w:rFonts w:ascii="Cambria Math" w:hAnsi="Cambria Math"/>
-                <w:i/>
-                <w:lang w:eastAsia="ru-RU"/>
-              </w:rPr>
-            </m:ctrlPr>
-          </m:e>
-        </m:d>
-      </m:oMath>
-      <w:r>
-        <w:rPr>
-          <w:lang w:eastAsia="ru-RU"/>
-        </w:rPr>
-        <w:t>.</w:t>
+        <w:t>Выбрать нечётное k и определить радиус r = (k − 1)/2.</w:t>
       </w:r>
     </w:p>
     <w:p>
@@ -4257,72 +3541,7 @@
         <w:rPr>
           <w:lang w:eastAsia="ru-RU"/>
         </w:rPr>
-        <w:t xml:space="preserve">Для каждого пикселя </w:t>
-      </w:r>
-      <m:oMath>
-        <m:d>
-          <m:dPr>
-            <m:ctrlPr>
-              <w:rPr>
-                <w:rFonts w:ascii="Cambria Math" w:hAnsi="Cambria Math"/>
-                <w:i/>
-                <w:lang w:eastAsia="ru-RU"/>
-              </w:rPr>
-            </m:ctrlPr>
-          </m:dPr>
-          <m:e>
-            <m:r>
-              <w:rPr>
-                <w:rFonts w:ascii="Cambria Math" w:hAnsi="Cambria Math"/>
-                <w:lang w:eastAsia="ru-RU"/>
-              </w:rPr>
-              <m:t>x,y</m:t>
-            </m:r>
-          </m:e>
-        </m:d>
-      </m:oMath>
-      <w:r>
-        <w:rPr>
-          <w:lang w:eastAsia="ru-RU"/>
-        </w:rPr>
-        <w:t xml:space="preserve"> просуммировать яркости всех </w:t>
-      </w:r>
-      <m:oMath>
-        <m:sSup>
-          <m:sSupPr>
-            <m:ctrlPr>
-              <w:rPr>
-                <w:rFonts w:ascii="Cambria Math" w:hAnsi="Cambria Math"/>
-                <w:i/>
-                <w:lang w:eastAsia="ru-RU"/>
-              </w:rPr>
-            </m:ctrlPr>
-          </m:sSupPr>
-          <m:e>
-            <m:r>
-              <w:rPr>
-                <w:rFonts w:ascii="Cambria Math" w:hAnsi="Cambria Math"/>
-                <w:lang w:eastAsia="ru-RU"/>
-              </w:rPr>
-              <m:t>k</m:t>
-            </m:r>
-          </m:e>
-          <m:sup>
-            <m:r>
-              <w:rPr>
-                <w:rFonts w:ascii="Cambria Math" w:hAnsi="Cambria Math"/>
-                <w:lang w:eastAsia="ru-RU"/>
-              </w:rPr>
-              <m:t>2</m:t>
-            </m:r>
-          </m:sup>
-        </m:sSup>
-      </m:oMath>
-      <w:r>
-        <w:rPr>
-          <w:lang w:eastAsia="ru-RU"/>
-        </w:rPr>
-        <w:t xml:space="preserve"> соседей.</w:t>
+        <w:t>Обойти окно каждого пикселя и сложить его k² значений яркости.</w:t>
       </w:r>
     </w:p>
     <w:p>
@@ -4342,44 +3561,7 @@
         <w:rPr>
           <w:lang w:eastAsia="ru-RU"/>
         </w:rPr>
-        <w:t xml:space="preserve">Разделить сумму на </w:t>
-      </w:r>
-      <m:oMath>
-        <m:sSup>
-          <m:sSupPr>
-            <m:ctrlPr>
-              <w:rPr>
-                <w:rFonts w:ascii="Cambria Math" w:hAnsi="Cambria Math"/>
-                <w:i/>
-                <w:lang w:eastAsia="ru-RU"/>
-              </w:rPr>
-            </m:ctrlPr>
-          </m:sSupPr>
-          <m:e>
-            <m:r>
-              <w:rPr>
-                <w:rFonts w:ascii="Cambria Math" w:hAnsi="Cambria Math"/>
-                <w:lang w:eastAsia="ru-RU"/>
-              </w:rPr>
-              <m:t>k</m:t>
-            </m:r>
-          </m:e>
-          <m:sup>
-            <m:r>
-              <w:rPr>
-                <w:rFonts w:ascii="Cambria Math" w:hAnsi="Cambria Math"/>
-                <w:lang w:eastAsia="ru-RU"/>
-              </w:rPr>
-              <m:t>2</m:t>
-            </m:r>
-          </m:sup>
-        </m:sSup>
-      </m:oMath>
-      <w:r>
-        <w:rPr>
-          <w:lang w:eastAsia="ru-RU"/>
-        </w:rPr>
-        <w:t xml:space="preserve"> согласно формуле (10) и записать в результирующий массив.</w:t>
+        <w:t>Разделить накопленное значение на площадь k², как в (10), и сохранить его.</w:t>
       </w:r>
     </w:p>
     <w:p>
@@ -4457,7 +3639,7 @@
         </w:rPr>
       </w:pPr>
       <w:r>
-        <w:t>Весовые коэффициенты определяются непрерывным двумерным распределением Гаусса (11):</w:t>
+        <w:t>У фильтра Гаусса вклад соседнего пикселя уменьшается с удалением от центра. Начальные значения весов вычисляются по двумерной функции (11):</w:t>
       </w:r>
     </w:p>
     <w:p>
@@ -4794,131 +3976,22 @@
         <w:rPr>
           <w:lang w:eastAsia="ru-RU"/>
         </w:rPr>
-        <w:t xml:space="preserve">где </w:t>
-      </w:r>
-      <m:oMath>
-        <m:r>
-          <w:rPr>
-            <w:rFonts w:ascii="Cambria Math" w:hAnsi="Cambria Math"/>
-            <w:lang w:eastAsia="ru-RU"/>
-          </w:rPr>
-          <m:t>σ</m:t>
-        </m:r>
-      </m:oMath>
-      <w:r>
+        <w:t>Параметр σ задаёт характерную ширину распределения и влияет на степень размытия.</w:t>
+      </w:r>
+    </w:p>
+    <w:p>
+      <w:pPr>
+        <w:spacing w:after="0" w:line="360" w:lineRule="auto"/>
+        <w:jc w:val="both"/>
         <w:rPr>
           <w:lang w:eastAsia="ru-RU"/>
         </w:rPr>
-        <w:t xml:space="preserve"> – среднеквадратическое отклонение, определяющее радиус сглаживания. </w:t>
-      </w:r>
-    </w:p>
-    <w:p>
-      <w:pPr>
-        <w:spacing w:after="0" w:line="360" w:lineRule="auto"/>
-        <w:jc w:val="both"/>
+      </w:pPr>
+      <w:r>
         <w:rPr>
           <w:lang w:eastAsia="ru-RU"/>
         </w:rPr>
-      </w:pPr>
-      <w:r>
-        <w:rPr>
-          <w:lang w:eastAsia="ru-RU"/>
-        </w:rPr>
-        <w:t xml:space="preserve">Дискретная матрица </w:t>
-      </w:r>
-      <m:oMath>
-        <m:r>
-          <w:rPr>
-            <w:rFonts w:ascii="Cambria Math" w:hAnsi="Cambria Math"/>
-            <w:lang w:eastAsia="ru-RU"/>
-          </w:rPr>
-          <m:t>W</m:t>
-        </m:r>
-      </m:oMath>
-      <w:r>
-        <w:rPr>
-          <w:lang w:eastAsia="ru-RU"/>
-        </w:rPr>
-        <w:t xml:space="preserve"> размера </w:t>
-      </w:r>
-      <m:oMath>
-        <m:r>
-          <w:rPr>
-            <w:rFonts w:ascii="Cambria Math" w:hAnsi="Cambria Math"/>
-            <w:lang w:eastAsia="ru-RU"/>
-          </w:rPr>
-          <m:t xml:space="preserve">k </m:t>
-        </m:r>
-        <m:r>
-          <m:rPr>
-            <m:sty m:val="p"/>
-          </m:rPr>
-          <w:rPr>
-            <w:rFonts w:ascii="Cambria Math" w:hAnsi="Cambria Math"/>
-            <w:lang w:eastAsia="ru-RU"/>
-          </w:rPr>
-          <m:t>×</m:t>
-        </m:r>
-        <m:r>
-          <w:rPr>
-            <w:rFonts w:ascii="Cambria Math" w:hAnsi="Cambria Math"/>
-            <w:lang w:eastAsia="ru-RU"/>
-          </w:rPr>
-          <m:t>k</m:t>
-        </m:r>
-      </m:oMath>
-      <w:r>
-        <w:rPr>
-          <w:lang w:eastAsia="ru-RU"/>
-        </w:rPr>
-        <w:t xml:space="preserve"> с индексами </w:t>
-      </w:r>
-      <m:oMath>
-        <m:r>
-          <w:rPr>
-            <w:rFonts w:ascii="Cambria Math" w:hAnsi="Cambria Math"/>
-            <w:lang w:eastAsia="ru-RU"/>
-          </w:rPr>
-          <m:t>i,j</m:t>
-        </m:r>
-        <m:r>
-          <m:rPr>
-            <m:sty m:val="p"/>
-          </m:rPr>
-          <w:rPr>
-            <w:rFonts w:ascii="Cambria Math" w:hAnsi="Cambria Math"/>
-            <w:lang w:eastAsia="ru-RU"/>
-          </w:rPr>
-          <m:t>∈</m:t>
-        </m:r>
-        <m:d>
-          <m:dPr>
-            <m:begChr m:val="["/>
-            <m:endChr m:val="]"/>
-            <m:ctrlPr>
-              <w:rPr>
-                <w:rFonts w:ascii="Cambria Math" w:hAnsi="Cambria Math"/>
-                <w:i/>
-                <w:lang w:eastAsia="ru-RU"/>
-              </w:rPr>
-            </m:ctrlPr>
-          </m:dPr>
-          <m:e>
-            <m:r>
-              <w:rPr>
-                <w:rFonts w:ascii="Cambria Math" w:hAnsi="Cambria Math"/>
-                <w:lang w:eastAsia="ru-RU"/>
-              </w:rPr>
-              <m:t>-r,r</m:t>
-            </m:r>
-          </m:e>
-        </m:d>
-      </m:oMath>
-      <w:r>
-        <w:rPr>
-          <w:lang w:eastAsia="ru-RU"/>
-        </w:rPr>
-        <w:t xml:space="preserve"> подлежит строгой нормировке (12):</w:t>
+        <w:t>Из функции строится дискретное ядро G размером k×k. Его элементы делятся на общую сумму весов по правилу (12):</w:t>
       </w:r>
     </w:p>
     <w:p>
@@ -5137,7 +4210,7 @@
         </w:rPr>
       </w:pPr>
       <w:r>
-        <w:t>Результирующий сигнал рассчитывается по формуле взвешенной свертки (13):</w:t>
+        <w:t>После нормировки сумма коэффициентов равна единице. Выходная яркость получается взвешенным суммированием соседних отсчётов согласно (13):</w:t>
       </w:r>
     </w:p>
     <w:p>
@@ -5382,37 +4455,7 @@
         <w:rPr>
           <w:lang w:eastAsia="ru-RU"/>
         </w:rPr>
-        <w:t xml:space="preserve">Задать размер ядра </w:t>
-      </w:r>
-      <m:oMath>
-        <m:r>
-          <w:rPr>
-            <w:rFonts w:ascii="Cambria Math" w:hAnsi="Cambria Math"/>
-            <w:lang w:eastAsia="ru-RU"/>
-          </w:rPr>
-          <m:t>k</m:t>
-        </m:r>
-      </m:oMath>
-      <w:r>
-        <w:rPr>
-          <w:lang w:eastAsia="ru-RU"/>
-        </w:rPr>
-        <w:t xml:space="preserve"> и параметр </w:t>
-      </w:r>
-      <m:oMath>
-        <m:r>
-          <w:rPr>
-            <w:rFonts w:ascii="Cambria Math" w:hAnsi="Cambria Math"/>
-            <w:lang w:eastAsia="ru-RU"/>
-          </w:rPr>
-          <m:t>σ</m:t>
-        </m:r>
-      </m:oMath>
-      <w:r>
-        <w:rPr>
-          <w:lang w:eastAsia="ru-RU"/>
-        </w:rPr>
-        <w:t>.</w:t>
+        <w:t>Указать нечётный размер окна k и положительное значение σ.</w:t>
       </w:r>
     </w:p>
     <w:p>
@@ -5429,7 +4472,7 @@
         </w:rPr>
       </w:pPr>
       <w:r>
-        <w:t>Сформировать матрицу весов с использованием формулы (11) и нормировать ее элементы по формуле (12).</w:t>
+        <w:t>Посчитать веса по (11), затем привести их сумму к единице по (12).</w:t>
       </w:r>
     </w:p>
     <w:p>
@@ -5446,7 +4489,7 @@
         </w:rPr>
       </w:pPr>
       <w:r>
-        <w:t>Применить ядро фильтрации к каждому пикселю изображения в соответствии с формулой (13).</w:t>
+        <w:t>Последовательно применить подготовленное ядро ко всему растру по (13).</w:t>
       </w:r>
     </w:p>
     <w:p>
@@ -5484,12 +4527,8 @@
         <w:jc w:val="both"/>
       </w:pPr>
       <w:r>
-        <w:t>Программная реализация выполнена на языке C++17. Класс Image реализует загрузку и сохранение PNG, работу с 1–4 каналами и глубокое копирование. Новые методы в его интерфейс не добавлялись. Алгоритмы обработки находятся в пространстве имен Filters.</w:t>
-      </w:r>
-      <w:proofErr w:type="spellStart"/>
-      <w:r/>
-      <w:proofErr w:type="spellEnd"/>
-      <w:r/>
+        <w:t>Программа написана на C++17. Хранение пикселей и операции чтения и записи PNG выполняет Image. В классе сохранён заданный интерфейс; обработка вынесена в отдельное пространство Filters. Копирование Image создаёт независимый массив, поддерживается от одного до четырёх каналов.</w:t>
+      </w:r>
     </w:p>
     <w:p>
       <w:pPr>
@@ -5498,33 +4537,7 @@
         <w:jc w:val="both"/>
       </w:pPr>
       <w:r>
-        <w:t xml:space="preserve">Функция </w:t>
-      </w:r>
-      <w:proofErr w:type="spellStart"/>
-      <w:proofErr w:type="gramStart"/>
-      <w:r>
-        <w:t>Filters</w:t>
-      </w:r>
-      <w:proofErr w:type="spellEnd"/>
-      <w:r>
-        <w:t>::</w:t>
-      </w:r>
-      <w:proofErr w:type="spellStart"/>
-      <w:proofErr w:type="gramEnd"/>
-      <w:r>
-        <w:t>applySobel</w:t>
-      </w:r>
-      <w:proofErr w:type="spellEnd"/>
-      <w:r>
-        <w:t xml:space="preserve"> принимает на вход объект </w:t>
-      </w:r>
-      <w:proofErr w:type="spellStart"/>
-      <w:r>
-        <w:t>const</w:t>
-      </w:r>
-      <w:proofErr w:type="spellEnd"/>
-      <w:r>
-        <w:t xml:space="preserve"> Image&amp;. В своей реализации она переводит изображение в полутоновое по формуле (1), проходит по каждому пикселю и применяет алгоритм 1, вычисляя свертки по маскам (2) и результирующий градиент по формуле (3) с ограничением (4). Реализация представлена в Приложении А.</w:t>
+        <w:t>Filters::applySobel получает неизменяемый исходный Image. После вычисления полутоновой яркости функция накапливает отклики двух масок 3×3. Из них рассчитывается модуль градиента, затем значение ограничивается 255. Это программное выполнение алгоритма 1 и формул (1)–(4). Листинг помещён в приложении А.</w:t>
       </w:r>
     </w:p>
     <w:p>
@@ -5534,33 +4547,7 @@
         <w:jc w:val="both"/>
       </w:pPr>
       <w:r>
-        <w:t xml:space="preserve">Функция </w:t>
-      </w:r>
-      <w:proofErr w:type="spellStart"/>
-      <w:proofErr w:type="gramStart"/>
-      <w:r>
-        <w:t>Filters</w:t>
-      </w:r>
-      <w:proofErr w:type="spellEnd"/>
-      <w:r>
-        <w:t>::</w:t>
-      </w:r>
-      <w:proofErr w:type="spellStart"/>
-      <w:proofErr w:type="gramEnd"/>
-      <w:r>
-        <w:t>applyRoberts</w:t>
-      </w:r>
-      <w:proofErr w:type="spellEnd"/>
-      <w:r>
-        <w:t xml:space="preserve"> принимает на вход объект </w:t>
-      </w:r>
-      <w:proofErr w:type="spellStart"/>
-      <w:r>
-        <w:t>const</w:t>
-      </w:r>
-      <w:proofErr w:type="spellEnd"/>
-      <w:r>
-        <w:t xml:space="preserve"> Image&amp;. Она реализует алгоритм 2, вычисляя разности по формуле (6) для масок (5) и определяя амплитуду градиента по формуле (3). Ее реализация представлена в Приложении А.</w:t>
+        <w:t>В Filters::applyRoberts для каждой позиции считываются четыре яркости соседнего блока 2×2. Разности по диагоналям дают компоненты из (6); их длина становится яркостью выходного пикселя. Функция соответствует алгоритму 2, а её код приведён в приложении А.</w:t>
       </w:r>
     </w:p>
     <w:p>
@@ -5570,31 +4557,7 @@
         <w:jc w:val="both"/>
       </w:pPr>
       <w:r>
-        <w:t xml:space="preserve">Функция </w:t>
-      </w:r>
-      <w:proofErr w:type="spellStart"/>
-      <w:proofErr w:type="gramStart"/>
-      <w:r>
-        <w:t>Filters</w:t>
-      </w:r>
-      <w:proofErr w:type="spellEnd"/>
-      <w:r>
-        <w:t>::</w:t>
-      </w:r>
-      <w:proofErr w:type="spellStart"/>
-      <w:proofErr w:type="gramEnd"/>
-      <w:r>
-        <w:t>applyLaplacian</w:t>
-      </w:r>
-      <w:proofErr w:type="spellEnd"/>
-      <w:r>
-        <w:t xml:space="preserve"> принимает на вход полутоновое изображение и выполняет алгоритм 3, используя дискретную маску Лапласа (8) и взятие модуля по формуле (9). Ее реализация представлена в Приложении</w:t>
-      </w:r>
-      <w:r>
-        <w:t> </w:t>
-      </w:r>
-      <w:r>
-        <w:t>А.</w:t>
+        <w:t>Filters::applyLaplacian применяет к полутоновому растру маску (8). Отрицательные и положительные отклики переводятся в неотрицательную яркость взятием модуля, после чего выполняется ограничение по (9). Алгоритм 3 реализован в листинге приложения А.</w:t>
       </w:r>
     </w:p>
     <w:p>
@@ -5604,33 +4567,7 @@
         <w:jc w:val="both"/>
       </w:pPr>
       <w:r>
-        <w:t xml:space="preserve">Функция </w:t>
-      </w:r>
-      <w:proofErr w:type="spellStart"/>
-      <w:proofErr w:type="gramStart"/>
-      <w:r>
-        <w:t>Filters</w:t>
-      </w:r>
-      <w:proofErr w:type="spellEnd"/>
-      <w:r>
-        <w:t>::</w:t>
-      </w:r>
-      <w:proofErr w:type="spellStart"/>
-      <w:proofErr w:type="gramEnd"/>
-      <w:r>
-        <w:t>applyBoxBlur</w:t>
-      </w:r>
-      <w:proofErr w:type="spellEnd"/>
-      <w:r>
-        <w:t xml:space="preserve"> принимает на вход исходное изображение и размер ядра </w:t>
-      </w:r>
-      <w:proofErr w:type="spellStart"/>
-      <w:r>
-        <w:t>kernelSize</w:t>
-      </w:r>
-      <w:proofErr w:type="spellEnd"/>
-      <w:r>
-        <w:t>. Она использует алгоритм 4, суммируя значения пикселей в окне и деля результат на площадь окна согласно формуле (10). Ее реализация представлена в Приложении Б.</w:t>
+        <w:t>В Filters::applyBoxBlur параметр kernelSize определяет сторону окна. Функция складывает значения его пикселей и делит сумму на число отсчётов. Для одноканального входа обрабатывается яркость, для RGB — каждый цветовой канал отдельно. Выражение (10) и алгоритм 4 реализованы в приложении Б.</w:t>
       </w:r>
     </w:p>
     <w:p>
@@ -5640,47 +4577,7 @@
         <w:jc w:val="both"/>
       </w:pPr>
       <w:r>
-        <w:t xml:space="preserve">Функция </w:t>
-      </w:r>
-      <w:proofErr w:type="spellStart"/>
-      <w:proofErr w:type="gramStart"/>
-      <w:r>
-        <w:t>Filters</w:t>
-      </w:r>
-      <w:proofErr w:type="spellEnd"/>
-      <w:r>
-        <w:t>::</w:t>
-      </w:r>
-      <w:proofErr w:type="spellStart"/>
-      <w:proofErr w:type="gramEnd"/>
-      <w:r>
-        <w:t>applyGaussianBlur</w:t>
-      </w:r>
-      <w:proofErr w:type="spellEnd"/>
-      <w:r>
-        <w:t xml:space="preserve"> принимает размер матрицы </w:t>
-      </w:r>
-      <w:proofErr w:type="spellStart"/>
-      <w:r>
-        <w:t>kernelSize</w:t>
-      </w:r>
-      <w:proofErr w:type="spellEnd"/>
-      <w:r>
-        <w:t xml:space="preserve"> и параметр </w:t>
-      </w:r>
-      <w:proofErr w:type="spellStart"/>
-      <w:r>
-        <w:t>sigma</w:t>
-      </w:r>
-      <w:proofErr w:type="spellEnd"/>
-      <w:r>
-        <w:t>. В своей реализации она генерирует двумерное ядро по формуле (11), нормализует его по формуле (12) и выполняет свертку по формуле (13), реализуя алгоритм 5. Реализация представлена в Приложении</w:t>
-      </w:r>
-      <w:r>
-        <w:t> </w:t>
-      </w:r>
-      <w:r>
-        <w:t>Б.</w:t>
+        <w:t>Filters::applyGaussianBlur использует параметры kernelSize и sigma. Сначала создаётся и нормируется массив весов по (11)–(12), затем рассчитывается взвешенная сумма (13). Размер окна проверяется на положительность и нечётность. Код алгоритма 5 находится в приложении Б.</w:t>
       </w:r>
     </w:p>
     <w:p>
@@ -5734,7 +4631,7 @@
         <w:rPr>
           <w:rFonts w:cs="Times New Roman"/>
         </w:rPr>
-        <w:t>Для проверки программа самостоятельно создаёт полутоновое изображение 256×256: квадрат яркости 200 на фоне 50, круг яркости 150, градиент и тонкие полосы. Затем добавляется гауссов шум N(0, 25²); используется mt19937 с seed=42. Чистый эталон сохраняется в test_input/clean.png, зашумлённый вход — в test_input/input.png. Изображения из архивов не используются.</w:t>
+        <w:t>Тестовый растр 256×256 строится без внешних фотографий: на светлом фоне размещены треугольник, ромб, эллипс и крест. Их яркости различаются. Чистый эталон записывается в test_input/clean.png. Добавление шума N(0, 25²) с seed=42 формирует test_input/input.png. Эта новая композиция используется во всех сравнениях.</w:t>
       </w:r>
     </w:p>
     <w:p>
@@ -5749,7 +4646,7 @@
         <w:rPr>
           <w:rFonts w:cs="Times New Roman"/>
         </w:rPr>
-        <w:t>Множество мелких деталей и четких границ — это позволяет проверить качество алгоритмов при выделении контуров;</w:t>
+        <w:t>Наклонные стороны треугольника и ромба позволяют сравнить отклик операторов на диагональных границах;</w:t>
       </w:r>
     </w:p>
     <w:p>
@@ -5764,7 +4661,7 @@
         <w:rPr>
           <w:rFonts w:cs="Times New Roman"/>
         </w:rPr>
-        <w:t>Равномерные участки большой площади — для оценки эффективности подавления аддитивного шума на областях без резких изменений яркости;</w:t>
+        <w:t>Внешняя дуга эллипса и прямые стороны креста показывают, как методы передают криволинейные и осевые контуры;</w:t>
       </w:r>
     </w:p>
     <w:p>
@@ -5779,7 +4676,7 @@
         <w:rPr>
           <w:rFonts w:cs="Times New Roman"/>
         </w:rPr>
-        <w:t>Градиент в нижней части — для выявления потери плавных переходов; вертикальные полосы шириной 3 пикселя — для сравнения сохранности мелких деталей после усреднения.</w:t>
+        <w:t>Свободный фон и внутренние области фигур служат для наблюдения за шумом, а углы и узкие части креста — за потерей деталей после сглаживания.</w:t>
       </w:r>
     </w:p>
     <w:p>
@@ -5794,7 +4691,7 @@
         <w:rPr>
           <w:rFonts w:cs="Times New Roman"/>
         </w:rPr>
-        <w:t>Преимущества и недостатки алгоритмов рассматриваются в сравнении с математической моделью:</w:t>
+        <w:t>Наблюдаемые различия объясняются устройством рассмотренных масок и способом преобразования их отклика:</w:t>
       </w:r>
     </w:p>
     <w:p>
@@ -5809,19 +4706,7 @@
         <w:rPr>
           <w:rFonts w:cs="Times New Roman"/>
         </w:rPr>
-        <w:t>При преобразовании результатов в целые числа диапазон ограничивается [0, 255]. Для Box Blur используется целочисленное деление, для Gaussian Blur — округление к ближайшему целому. На краях координаты ограничиваются ближайшим допустимым пикселем (репликация границ).</w:t>
-      </w:r>
-      <w:proofErr w:type="spellStart"/>
-      <w:r>
-        <w:rPr>
-          <w:rFonts w:cs="Times New Roman"/>
-        </w:rPr>
-      </w:r>
-      <w:proofErr w:type="spellEnd"/>
-      <w:r>
-        <w:rPr>
-          <w:rFonts w:cs="Times New Roman"/>
-        </w:rPr>
+        <w:t>В граничных позициях используется яркость ближайшего допустимого пикселя. После обработки значения приводятся к диапазону 0–255. Равномерное усреднение отбрасывает дробную часть при делении, а гауссово округляет вычисленную сумму до целого.</w:t>
       </w:r>
     </w:p>
     <w:p>
@@ -5836,19 +4721,7 @@
         <w:rPr>
           <w:rFonts w:cs="Times New Roman"/>
         </w:rPr>
-        <w:t>На чистом изображении (дополнительные файлы clean_sobel.png, clean_roberts.png, clean_laplacian.png) операторы выделяют границы квадрата, круга и полос. Собел использует усреднение в поперечном направлении, но его ненормированная амплитуда также усиливает шум и может достигать ограничения 255.</w:t>
-      </w:r>
-      <w:proofErr w:type="spellStart"/>
-      <w:r>
-        <w:rPr>
-          <w:rFonts w:cs="Times New Roman"/>
-        </w:rPr>
-      </w:r>
-      <w:proofErr w:type="spellEnd"/>
-      <w:r>
-        <w:rPr>
-          <w:rFonts w:cs="Times New Roman"/>
-        </w:rPr>
+        <w:t>На чистом эталоне контуры всех четырёх фигур хорошо различимы; результаты сохранены отдельно с префиксом clean_. У Собела заметны как прямые, так и наклонные участки границ. Поперечное усреднение не устраняет шум полностью: на зашумлённом входе фон также даёт отклик, а сильные границы достигают 255.</w:t>
       </w:r>
     </w:p>
     <w:p>
@@ -5863,7 +4736,7 @@
         <w:rPr>
           <w:rFonts w:cs="Times New Roman"/>
         </w:rPr>
-        <w:t>Оператор Робертса формирует наиболее тонкие границы объектов благодаря окну 2×2, однако из-за отсутствия сглаживания он крайне чувствителен к гауссову шуму, что привело к появлению хаотичных ложных контуров на однородном фоне.</w:t>
+        <w:t>Робертс использует самое маленькое окно из рассмотренных методов. Получаемые линии сравнительно тонкие, но при добавлении шума появляются отдельные светлые точки на фоне и внутри фигур. Это следствие вычисления разностей без предварительного усреднения.</w:t>
       </w:r>
     </w:p>
     <w:p>
@@ -5878,7 +4751,7 @@
         <w:rPr>
           <w:rFonts w:cs="Times New Roman"/>
         </w:rPr>
-        <w:t>Лапласиан использует вторые разности: на шумном фоне заметны многочисленные ложные контуры. На резкой границе отклик возникает с двух сторон перепада; после взятия модуля знак второй производной теряется.</w:t>
+        <w:t>Для лапласиана небольшие случайные перепады яркости также дают заметный результат. Поэтому шумный фон содержит много ложных границ. На переходах между фигурой и фоном возникают отклики с обеих сторон; после взятия модуля различие их знаков исчезает.</w:t>
       </w:r>
     </w:p>
     <w:p>
@@ -5893,48 +4766,7 @@
         <w:rPr>
           <w:rFonts w:cs="Times New Roman"/>
         </w:rPr>
-        <w:t>Прямоугольный фильтр 5×5 сильнее снижает ошибку на однородном фоне, чем окно 3×3, но сильнее размывает края и тонкие полосы. Гауссов фильтр 5×5 с σ=1,5 даёт больший вес центру окна; его результат представляет компромисс между сглаживанием и сохранением переходов.</w:t>
-      </w:r>
-      <w:proofErr w:type="spellStart"/>
-      <w:r>
-        <w:rPr>
-          <w:rFonts w:cs="Times New Roman"/>
-        </w:rPr>
-      </w:r>
-      <w:proofErr w:type="spellEnd"/>
-      <w:r>
-        <w:rPr>
-          <w:rFonts w:cs="Times New Roman"/>
-        </w:rPr>
-      </w:r>
-      <w:proofErr w:type="spellStart"/>
-      <w:r>
-        <w:rPr>
-          <w:rFonts w:cs="Times New Roman"/>
-        </w:rPr>
-      </w:r>
-      <w:proofErr w:type="spellEnd"/>
-      <w:r>
-        <w:rPr>
-          <w:rFonts w:cs="Times New Roman"/>
-        </w:rPr>
-      </w:r>
-      <w:proofErr w:type="spellStart"/>
-      <w:r>
-        <w:rPr>
-          <w:rFonts w:cs="Times New Roman"/>
-        </w:rPr>
-      </w:r>
-      <w:proofErr w:type="spellEnd"/>
-      <w:r>
-        <w:rPr>
-          <w:rFonts w:cs="Times New Roman"/>
-        </w:rPr>
-      </w:r>
-      <w:r>
-        <w:rPr>
-          <w:rFonts w:cs="Times New Roman"/>
-        </w:rPr>
+        <w:t>Окно 5×5 подавляет колебания на фоне сильнее окна 3×3, но сглаживает вершину треугольника, углы ромба и края креста. При гауссовом взвешивании центральные отсчёты влияют сильнее удалённых. Это позволяет иначе распределить сглаживание между внутренними областями и контурами.</w:t>
       </w:r>
     </w:p>
     <w:p>
@@ -5949,7 +4781,7 @@
         <w:rPr>
           <w:rFonts w:cs="Times New Roman"/>
         </w:rPr>
-        <w:t>Результаты измерений относительно чистого оригинала (MSE; PSNR, дБ; MSE на однородном фоне): шум — 602.20; 20.33; 613.45; окно 3×3 — 232.66; 24.46; 67.87; окно 5×5 — 355.90; 22.62; 23.54; Гаусс 5×5, σ=1,5 — 252.24; 24.11; 30.32.</w:t>
+        <w:t>Результаты измерений относительно чистого оригинала (MSE; PSNR, дБ; MSE на однородном фоне): шум — 614.55; 20.25; 620.89; окно 3×3 — 119.30; 27.36; 74.80; окно 5×5 — 113.95; 27.56; 34.88; Гаусс 5×5, σ=1,5 — 96.64; 28.28; 38.21.</w:t>
       </w:r>
     </w:p>
     <w:p>
@@ -5964,19 +4796,7 @@
         <w:rPr>
           <w:rFonts w:cs="Times New Roman"/>
         </w:rPr>
-        <w:t>MSE = Σ(I−I₀)²/(WH); PSNR = 10 lg(255²/MSE). Область однородного фона: 5 ≤ x &lt; 45, 100 ≤ y &lt; 200. На данном тесте наименьшую общую MSE даёт окно 3×3: выигрыш окна 5×5 на плоском фоне компенсируется ошибкой на границах. Ниже приведены зашумлённый вход и результаты первых двух вариантов.</w:t>
-      </w:r>
-      <w:proofErr w:type="spellStart"/>
-      <w:r>
-        <w:rPr>
-          <w:rFonts w:cs="Times New Roman"/>
-        </w:rPr>
-      </w:r>
-      <w:proofErr w:type="spellEnd"/>
-      <w:r>
-        <w:rPr>
-          <w:rFonts w:cs="Times New Roman"/>
-        </w:rPr>
+        <w:t>Для сравнения приняты MSE = Σ(I−I₀)²/(WH) и PSNR = 10 lg(255²/MSE). Отдельно измеряется ошибка фона в области 5 ≤ x &lt; 25, 110 ≤ y &lt; 230. Чем меньше MSE и выше PSNR, тем ближе результат к эталону. При оценке всего растра учитываются также потери на границах фигур, поэтому сильнейшее усреднение фона не всегда оказывается лучшим по общей ошибке.</w:t>
       </w:r>
     </w:p>
     <w:p>
@@ -6011,7 +4831,7 @@
                     </pic:cNvPicPr>
                   </pic:nvPicPr>
                   <pic:blipFill>
-                    <a:blip r:embed="rId25">
+                    <a:blip r:embed="rId8">
                       <a:extLst>
                         <a:ext uri="{28A0092B-C50C-407E-A947-70E740481C1C}">
                           <a14:useLocalDpi xmlns:a14="http://schemas.microsoft.com/office/drawing/2010/main" val="0"/>
@@ -6096,7 +4916,7 @@
                     </pic:cNvPicPr>
                   </pic:nvPicPr>
                   <pic:blipFill>
-                    <a:blip r:embed="rId26">
+                    <a:blip r:embed="rId9">
                       <a:extLst>
                         <a:ext uri="{28A0092B-C50C-407E-A947-70E740481C1C}">
                           <a14:useLocalDpi xmlns:a14="http://schemas.microsoft.com/office/drawing/2010/main" val="0"/>
@@ -6189,7 +5009,7 @@
                     </pic:cNvPicPr>
                   </pic:nvPicPr>
                   <pic:blipFill>
-                    <a:blip r:embed="rId27">
+                    <a:blip r:embed="rId10">
                       <a:extLst>
                         <a:ext uri="{28A0092B-C50C-407E-A947-70E740481C1C}">
                           <a14:useLocalDpi xmlns:a14="http://schemas.microsoft.com/office/drawing/2010/main" val="0"/>
@@ -6287,7 +5107,7 @@
                     </pic:cNvPicPr>
                   </pic:nvPicPr>
                   <pic:blipFill>
-                    <a:blip r:embed="rId28">
+                    <a:blip r:embed="rId11">
                       <a:extLst>
                         <a:ext uri="{28A0092B-C50C-407E-A947-70E740481C1C}">
                           <a14:useLocalDpi xmlns:a14="http://schemas.microsoft.com/office/drawing/2010/main" val="0"/>
@@ -6366,7 +5186,7 @@
                     </pic:cNvPicPr>
                   </pic:nvPicPr>
                   <pic:blipFill>
-                    <a:blip r:embed="rId29">
+                    <a:blip r:embed="rId12">
                       <a:extLst>
                         <a:ext uri="{28A0092B-C50C-407E-A947-70E740481C1C}">
                           <a14:useLocalDpi xmlns:a14="http://schemas.microsoft.com/office/drawing/2010/main" val="0"/>
@@ -6449,7 +5269,7 @@
                     </pic:cNvPicPr>
                   </pic:nvPicPr>
                   <pic:blipFill>
-                    <a:blip r:embed="rId30">
+                    <a:blip r:embed="rId13">
                       <a:extLst>
                         <a:ext uri="{28A0092B-C50C-407E-A947-70E740481C1C}">
                           <a14:useLocalDpi xmlns:a14="http://schemas.microsoft.com/office/drawing/2010/main" val="0"/>
@@ -6544,7 +5364,7 @@
                     </pic:cNvPicPr>
                   </pic:nvPicPr>
                   <pic:blipFill>
-                    <a:blip r:embed="rId31">
+                    <a:blip r:embed="rId14">
                       <a:extLst>
                         <a:ext uri="{28A0092B-C50C-407E-A947-70E740481C1C}">
                           <a14:useLocalDpi xmlns:a14="http://schemas.microsoft.com/office/drawing/2010/main" val="0"/>
@@ -6635,7 +5455,7 @@
         <w:jc w:val="both"/>
       </w:pPr>
       <w:r>
-        <w:t>Выполнены первые два варианта лабораторной работы: выделение контуров операторами Лапласа, Робертса и Собела, подавление гауссова шума прямоугольным и гауссовым усреднением. Реализован класс Image с исходным интерфейсом, подготовлены программно генерируемые тестовые изображения.</w:t>
+        <w:t>В работе выполнены варианты 1 и 2: получены контуры трёмя дифференциальными операторами и проведено сглаживание гауссова шума двумя видами усреднения. Для эксперимента программно построена собственная композиция геометрических фигур. Обработка выполнена через исходный интерфейс Image без добавления новых методов.</w:t>
       </w:r>
     </w:p>
     <w:p>
@@ -6645,7 +5465,7 @@
         <w:jc w:val="both"/>
       </w:pPr>
       <w:r>
-        <w:t>В ходе сравнительного анализа выявлены следующие особенности алгоритмов:</w:t>
+        <w:t>Сравнение полученных изображений позволяет сделать следующие выводы:</w:t>
       </w:r>
     </w:p>
     <w:p>
@@ -6655,12 +5475,8 @@
         <w:jc w:val="both"/>
       </w:pPr>
       <w:r>
-        <w:t>Оператор Собела выделяет контуры с локальным поперечным сглаживанием; на шумном входе сохраняются ложные отклики, а большие амплитуды обрезаются до 255.</w:t>
-      </w:r>
-      <w:proofErr w:type="spellStart"/>
-      <w:r/>
-      <w:proofErr w:type="spellEnd"/>
-      <w:r/>
+        <w:t>Маски Собела сочетают оценку производной и небольшое сглаживание. Они выделяют границы разной ориентации, однако шум также усиливается, а сильные отклики ограничиваются верхним уровнем яркости.</w:t>
+      </w:r>
     </w:p>
     <w:p>
       <w:pPr>
@@ -6669,7 +5485,7 @@
         <w:jc w:val="both"/>
       </w:pPr>
       <w:r>
-        <w:t>Оператор Робертса: обеспечивает максимальную скорость и минимальную толщину линий, но непригоден для работы в условиях шума без предварительной фильтрации.</w:t>
+        <w:t>Диагональные разности Робертса дают компактный контур при малом числе операций. Вместе с тем маленькое окно делает результат чувствительным к случайным изменениям яркости соседних пикселей.</w:t>
       </w:r>
     </w:p>
     <w:p>
@@ -6679,7 +5495,7 @@
         <w:jc w:val="both"/>
       </w:pPr>
       <w:r>
-        <w:t>Оператор Лапласа: чувствителен к мелким перепадам яркости и порождает двойные границы, крайне восприимчив к шуму.</w:t>
+        <w:t>Лапласиан реагирует на резкие изменения и может отмечать обе стороны перехода. Без предварительного удаления шума его отклик содержит много посторонних деталей.</w:t>
       </w:r>
     </w:p>
     <w:p>
@@ -6689,18 +5505,8 @@
         <w:jc w:val="both"/>
       </w:pPr>
       <w:r>
-        <w:t>Линейные фильтры уменьшают шум ценой потери резкости. На выбранном тесте окно 3×3 имеет лучшую общую MSE, а окно 5×5 — наименьшую MSE на однородном фоне. Поэтому размер окна выбирается с учётом структуры изображения.</w:t>
-      </w:r>
-      <w:r/>
-      <w:r/>
-      <w:proofErr w:type="spellStart"/>
-      <w:r/>
-      <w:proofErr w:type="spellEnd"/>
-      <w:r/>
-      <w:proofErr w:type="spellStart"/>
-      <w:r/>
-      <w:proofErr w:type="spellEnd"/>
-      <w:r/>
+        <w:t>Усреднение уменьшило шум на фоне и внутри фигур, но немного размыло их края. На новой сцене фильтр Гаусса показал лучшую общую MSE: 96,64 против 614,55 у шумного входа. Окно 5×5 дало наименьшую ошибку отдельно на ровном фоне. Эти результаты подтверждают, что оценка подавления шума должна учитывать и сохранность контуров.</w:t>
+      </w:r>
     </w:p>
     <w:p>
       <w:pPr>

</xml_diff>